<commit_message>
Asset registry, editable Assets + pagination, Equipment Maps page, demo toggle, docs
</commit_message>
<xml_diff>
--- a/Supervisor Docs/Warehouse WMS - User Guide & Journeys.docx
+++ b/Supervisor Docs/Warehouse WMS - User Guide & Journeys.docx
@@ -82,6 +82,17 @@
       </w:r>
       <w:r>
         <w:t xml:space="preserve"> badges; each one marks a feature built for the Version 3 requirements. Hover a badge to read the exact requirement it fulfills.</w:t>
+      </w:r>
+    </w:p>
+    <w:p>
+      <w:r>
+        <w:rPr>
+          <w:b/>
+        </w:rPr>
+        <w:t xml:space="preserve">Update (2026-06-25): </w:t>
+      </w:r>
+      <w:r>
+        <w:t>The latest amendment refined how assets work: only assemblies are tracked as assets, and laptops/gameshows are now assembly-only items. For the full detail see “What's New - Asset Model Amendment” and the “User Guide Addendum (Item Types &amp; Assemblies)”.</w:t>
       </w:r>
     </w:p>
     <w:p>
@@ -2104,7 +2115,7 @@
         <w:spacing w:after="120"/>
       </w:pPr>
       <w:r>
-        <w:t xml:space="preserve">One searchable list of single items and groups (bundles). Click any row to open it.</w:t>
+        <w:t>One searchable list of single items, groups (bundles), and assemblies (tracked carts and single-item units like laptops). Click any row to open it.</w:t>
       </w:r>
     </w:p>
     <w:p>
@@ -2229,14 +2240,76 @@
         <w:spacing w:after="60"/>
       </w:pPr>
       <w:r>
+        <w:t>New PO — add items, set quantities and costs, and add internal landed costs (freight/duty). One PO is for a single vendor. The deposit auto-fills from that vendor's rule (PO-1).</w:t>
+      </w:r>
+    </w:p>
+    <w:p>
+      <w:pPr>
+        <w:pStyle w:val="ListParagraph"/>
+        <w:numPr>
+          <w:ilvl w:val="0"/>
+          <w:numId w:val="2"/>
+        </w:numPr>
+        <w:spacing w:after="60"/>
+      </w:pPr>
+      <w:r>
         <w:rPr>
           <w:b/>
           <w:bCs/>
         </w:rPr>
-        <w:t xml:space="preserve">New PO — </w:t>
-      </w:r>
-      <w:r>
-        <w:t xml:space="preserve">add items, set quantities and costs, optionally allow multiple vendors per line, and add internal landed costs (freight/duty).</w:t>
+        <w:t xml:space="preserve">Send — </w:t>
+      </w:r>
+      <w:r>
+        <w:t xml:space="preserve">emails the PO to the vendor (internal landed costs are withheld).</w:t>
+      </w:r>
+    </w:p>
+    <w:p>
+      <w:pPr>
+        <w:pStyle w:val="ListParagraph"/>
+        <w:numPr>
+          <w:ilvl w:val="0"/>
+          <w:numId w:val="2"/>
+        </w:numPr>
+        <w:spacing w:after="60"/>
+      </w:pPr>
+      <w:r>
+        <w:t>Receive — posts goods into stock, generates a Vendor bill, and shows the remaining balance owed (PO-3). Record and edit payments (PO-4); Record Payment disappears once the PO is fully paid (PO-5). Save closes the PO (PO-2).</w:t>
+      </w:r>
+    </w:p>
+    <w:p>
+      <w:pPr>
+        <w:pStyle w:val="Heading2"/>
+      </w:pPr>
+      <w:r>
+        <w:t xml:space="preserve">Sales Order</w:t>
+      </w:r>
+    </w:p>
+    <w:p>
+      <w:pPr>
+        <w:spacing w:after="120"/>
+      </w:pPr>
+      <w:r>
+        <w:t xml:space="preserve">Send items to any recipient.</w:t>
+      </w:r>
+    </w:p>
+    <w:p>
+      <w:pPr>
+        <w:pStyle w:val="ListParagraph"/>
+        <w:numPr>
+          <w:ilvl w:val="0"/>
+          <w:numId w:val="2"/>
+        </w:numPr>
+        <w:spacing w:after="60"/>
+      </w:pPr>
+      <w:r>
+        <w:rPr>
+          <w:b/>
+          <w:bCs/>
+        </w:rPr>
+        <w:t xml:space="preserve">New SO — </w:t>
+      </w:r>
+      <w:r>
+        <w:t xml:space="preserve">one search finds any recipient </w:t>
       </w:r>
       <w:r>
         <w:rPr>
@@ -2244,50 +2317,10 @@
           <w:bCs/>
           <w:color w:val="92400E"/>
         </w:rPr>
-        <w:t xml:space="preserve">  V3 · PO-1</w:t>
-      </w:r>
-      <w:r>
-        <w:t xml:space="preserve"> the deposit auto-fills from the vendor.</w:t>
-      </w:r>
-    </w:p>
-    <w:p>
-      <w:pPr>
-        <w:pStyle w:val="ListParagraph"/>
-        <w:numPr>
-          <w:ilvl w:val="0"/>
-          <w:numId w:val="2"/>
-        </w:numPr>
-        <w:spacing w:after="60"/>
-      </w:pPr>
-      <w:r>
-        <w:rPr>
-          <w:b/>
-          <w:bCs/>
-        </w:rPr>
-        <w:t xml:space="preserve">Send — </w:t>
-      </w:r>
-      <w:r>
-        <w:t xml:space="preserve">emails the PO to the vendor (internal landed costs are withheld).</w:t>
-      </w:r>
-    </w:p>
-    <w:p>
-      <w:pPr>
-        <w:pStyle w:val="ListParagraph"/>
-        <w:numPr>
-          <w:ilvl w:val="0"/>
-          <w:numId w:val="2"/>
-        </w:numPr>
-        <w:spacing w:after="60"/>
-      </w:pPr>
-      <w:r>
-        <w:rPr>
-          <w:b/>
-          <w:bCs/>
-        </w:rPr>
-        <w:t xml:space="preserve">Receive — </w:t>
-      </w:r>
-      <w:r>
-        <w:t xml:space="preserve">posts goods into stock, generates a Vendor bill per vendor, and shows the </w:t>
+        <w:t xml:space="preserve">V3 · SO-1</w:t>
+      </w:r>
+      <w:r>
+        <w:t xml:space="preserve">; the address line offers Google-style lookup </w:t>
       </w:r>
       <w:r>
         <w:rPr>
@@ -2295,10 +2328,10 @@
           <w:bCs/>
           <w:color w:val="92400E"/>
         </w:rPr>
-        <w:t xml:space="preserve">V3 · PO-3</w:t>
-      </w:r>
-      <w:r>
-        <w:t xml:space="preserve"> remaining balance owed. Record and edit payments </w:t>
+        <w:t xml:space="preserve">V3 · SO-2</w:t>
+      </w:r>
+      <w:r>
+        <w:t xml:space="preserve">; add a bundle as a single group line that scales </w:t>
       </w:r>
       <w:r>
         <w:rPr>
@@ -2306,10 +2339,43 @@
           <w:bCs/>
           <w:color w:val="92400E"/>
         </w:rPr>
-        <w:t xml:space="preserve">V3 · PO-4</w:t>
-      </w:r>
-      <w:r>
-        <w:t xml:space="preserve">; Save closes the PO </w:t>
+        <w:t xml:space="preserve">V3 · SO-GRP-1</w:t>
+      </w:r>
+      <w:r>
+        <w:t xml:space="preserve">.</w:t>
+      </w:r>
+    </w:p>
+    <w:p>
+      <w:pPr>
+        <w:pStyle w:val="ListParagraph"/>
+        <w:numPr>
+          <w:ilvl w:val="0"/>
+          <w:numId w:val="2"/>
+        </w:numPr>
+        <w:spacing w:after="60"/>
+      </w:pPr>
+      <w:r>
+        <w:t>Ship — ship in full or partially; short stock can create a back order automatically. To send a laptop, gameshow, or cart, add it as an assembly and pick the specific built unit; a cart is assigned to the facility + Regional and a laptop/gameshow to the employee.</w:t>
+      </w:r>
+    </w:p>
+    <w:p>
+      <w:pPr>
+        <w:pStyle w:val="ListParagraph"/>
+        <w:numPr>
+          <w:ilvl w:val="0"/>
+          <w:numId w:val="2"/>
+        </w:numPr>
+        <w:spacing w:after="60"/>
+      </w:pPr>
+      <w:r>
+        <w:rPr>
+          <w:b/>
+          <w:bCs/>
+        </w:rPr>
+        <w:t xml:space="preserve">Attachments — </w:t>
+      </w:r>
+      <w:r>
+        <w:t xml:space="preserve">upload a BOL or proof of delivery </w:t>
       </w:r>
       <w:r>
         <w:rPr>
@@ -2317,26 +2383,10 @@
           <w:bCs/>
           <w:color w:val="92400E"/>
         </w:rPr>
-        <w:t xml:space="preserve">V3 · PO-2</w:t>
-      </w:r>
-      <w:r>
-        <w:t xml:space="preserve">.</w:t>
-      </w:r>
-    </w:p>
-    <w:p>
-      <w:pPr>
-        <w:pStyle w:val="Heading2"/>
-      </w:pPr>
-      <w:r>
-        <w:t xml:space="preserve">Sales Order</w:t>
-      </w:r>
-    </w:p>
-    <w:p>
-      <w:pPr>
-        <w:spacing w:after="120"/>
-      </w:pPr>
-      <w:r>
-        <w:t xml:space="preserve">Send items to any recipient.</w:t>
+        <w:t xml:space="preserve">V3 · SO-4</w:t>
+      </w:r>
+      <w:r>
+        <w:t xml:space="preserve">; it also appears under the destination facility.</w:t>
       </w:r>
     </w:p>
     <w:p>
@@ -2353,10 +2403,10 @@
           <w:b/>
           <w:bCs/>
         </w:rPr>
-        <w:t xml:space="preserve">New SO — </w:t>
-      </w:r>
-      <w:r>
-        <w:t xml:space="preserve">one search finds any recipient </w:t>
+        <w:t xml:space="preserve">Shipping slips — </w:t>
+      </w:r>
+      <w:r>
+        <w:t xml:space="preserve">print one order per page, numbered when several go to the same place </w:t>
       </w:r>
       <w:r>
         <w:rPr>
@@ -2364,110 +2414,6 @@
           <w:bCs/>
           <w:color w:val="92400E"/>
         </w:rPr>
-        <w:t xml:space="preserve">V3 · SO-1</w:t>
-      </w:r>
-      <w:r>
-        <w:t xml:space="preserve">; the address line offers Google-style lookup </w:t>
-      </w:r>
-      <w:r>
-        <w:rPr>
-          <w:b/>
-          <w:bCs/>
-          <w:color w:val="92400E"/>
-        </w:rPr>
-        <w:t xml:space="preserve">V3 · SO-2</w:t>
-      </w:r>
-      <w:r>
-        <w:t xml:space="preserve">; add a bundle as a single group line that scales </w:t>
-      </w:r>
-      <w:r>
-        <w:rPr>
-          <w:b/>
-          <w:bCs/>
-          <w:color w:val="92400E"/>
-        </w:rPr>
-        <w:t xml:space="preserve">V3 · SO-GRP-1</w:t>
-      </w:r>
-      <w:r>
-        <w:t xml:space="preserve">.</w:t>
-      </w:r>
-    </w:p>
-    <w:p>
-      <w:pPr>
-        <w:pStyle w:val="ListParagraph"/>
-        <w:numPr>
-          <w:ilvl w:val="0"/>
-          <w:numId w:val="2"/>
-        </w:numPr>
-        <w:spacing w:after="60"/>
-      </w:pPr>
-      <w:r>
-        <w:rPr>
-          <w:b/>
-          <w:bCs/>
-        </w:rPr>
-        <w:t xml:space="preserve">Ship — </w:t>
-      </w:r>
-      <w:r>
-        <w:t xml:space="preserve">ship in full or partially; short stock can create a back order automatically. Laptops and trivia can be assigned to an employee on ship-out.</w:t>
-      </w:r>
-    </w:p>
-    <w:p>
-      <w:pPr>
-        <w:pStyle w:val="ListParagraph"/>
-        <w:numPr>
-          <w:ilvl w:val="0"/>
-          <w:numId w:val="2"/>
-        </w:numPr>
-        <w:spacing w:after="60"/>
-      </w:pPr>
-      <w:r>
-        <w:rPr>
-          <w:b/>
-          <w:bCs/>
-        </w:rPr>
-        <w:t xml:space="preserve">Attachments — </w:t>
-      </w:r>
-      <w:r>
-        <w:t xml:space="preserve">upload a BOL or proof of delivery </w:t>
-      </w:r>
-      <w:r>
-        <w:rPr>
-          <w:b/>
-          <w:bCs/>
-          <w:color w:val="92400E"/>
-        </w:rPr>
-        <w:t xml:space="preserve">V3 · SO-4</w:t>
-      </w:r>
-      <w:r>
-        <w:t xml:space="preserve">; it also appears under the destination facility.</w:t>
-      </w:r>
-    </w:p>
-    <w:p>
-      <w:pPr>
-        <w:pStyle w:val="ListParagraph"/>
-        <w:numPr>
-          <w:ilvl w:val="0"/>
-          <w:numId w:val="2"/>
-        </w:numPr>
-        <w:spacing w:after="60"/>
-      </w:pPr>
-      <w:r>
-        <w:rPr>
-          <w:b/>
-          <w:bCs/>
-        </w:rPr>
-        <w:t xml:space="preserve">Shipping slips — </w:t>
-      </w:r>
-      <w:r>
-        <w:t xml:space="preserve">print one order per page, numbered when several go to the same place </w:t>
-      </w:r>
-      <w:r>
-        <w:rPr>
-          <w:b/>
-          <w:bCs/>
-          <w:color w:val="92400E"/>
-        </w:rPr>
         <w:t xml:space="preserve">V3 · SO-5</w:t>
       </w:r>
       <w:r>
@@ -2619,18 +2565,7 @@
         <w:spacing w:after="80"/>
       </w:pPr>
       <w:r>
-        <w:t xml:space="preserve">Choose the vendor. The Deposit auto-fills from that vendor's rule </w:t>
-      </w:r>
-      <w:r>
-        <w:rPr>
-          <w:b/>
-          <w:bCs/>
-          <w:color w:val="92400E"/>
-        </w:rPr>
-        <w:t xml:space="preserve">V3 · PO-1</w:t>
-      </w:r>
-      <w:r>
-        <w:t xml:space="preserve"> — you can still type a different amount. (Tick “Allow multiple vendors” if lines come from different vendors.)</w:t>
+        <w:t>Choose the vendor (one vendor per PO). The Deposit auto-fills from that vendor's rule (PO-1) and calculates off the full bill total — you can still type a different amount.</w:t>
       </w:r>
     </w:p>
     <w:p>
@@ -2669,18 +2604,7 @@
         <w:spacing w:after="80"/>
       </w:pPr>
       <w:r>
-        <w:t xml:space="preserve">When goods arrive, click Receive, enter the quantities, and post. Stock rises in Inventory, a Vendor bill is created per vendor, and the green banner shows the </w:t>
-      </w:r>
-      <w:r>
-        <w:rPr>
-          <w:b/>
-          <w:bCs/>
-          <w:color w:val="92400E"/>
-        </w:rPr>
-        <w:t xml:space="preserve">V3 · PO-3</w:t>
-      </w:r>
-      <w:r>
-        <w:t xml:space="preserve"> remaining balance owed.</w:t>
+        <w:t>When goods arrive, click Receive, enter the quantities, and post. Stock rises in Inventory, a Vendor bill is created, and the green banner shows the remaining balance owed (PO-3).</w:t>
       </w:r>
     </w:p>
     <w:p>
@@ -3068,6 +2992,270 @@
           <w:szCs w:val="20"/>
         </w:rPr>
         <w:t xml:space="preserve">Status at time of writing: all 11 Version-3 requirements are built and verified; automated checks pass (51 journey checks + 19 requirement checks) and the production build is clean.</w:t>
+      </w:r>
+    </w:p>
+    <w:p>
+      <w:r>
+        <w:br w:type="page"/>
+      </w:r>
+    </w:p>
+    <w:p>
+      <w:r>
+        <w:rPr>
+          <w:b/>
+          <w:color w:val="1F3864"/>
+          <w:sz w:val="32"/>
+        </w:rPr>
+        <w:t>New since this guide — Assets register, Equipment Maps &amp; the demo toggle (2026-06-25)</w:t>
+      </w:r>
+    </w:p>
+    <w:p>
+      <w:r>
+        <w:t>These additions sit alongside the sections above. They use your real equipment list and keep to the supervisor's rules (carts belong to facilities; IT equipment belongs to employees).</w:t>
+      </w:r>
+    </w:p>
+    <w:p>
+      <w:r>
+        <w:rPr>
+          <w:b/>
+          <w:color w:val="2E5496"/>
+          <w:sz w:val="26"/>
+        </w:rPr>
+        <w:t>Assets — the company equipment register</w:t>
+      </w:r>
+    </w:p>
+    <w:p>
+      <w:pPr>
+        <w:spacing w:after="80"/>
+        <w:ind w:left="280"/>
+      </w:pPr>
+      <w:r>
+        <w:rPr>
+          <w:b/>
+        </w:rPr>
+        <w:t xml:space="preserve">Browse by class. </w:t>
+      </w:r>
+      <w:r>
+        <w:t>Open Assets and pick a class tab (Carts, Laptops, Game Shows, Tablets, Monitors, Desktops, Cell Phones, EZ Pass). The status chips at the top jump you to a group such as Out of Service.</w:t>
+      </w:r>
+    </w:p>
+    <w:p>
+      <w:pPr>
+        <w:spacing w:after="80"/>
+        <w:ind w:left="280"/>
+      </w:pPr>
+      <w:r>
+        <w:rPr>
+          <w:b/>
+        </w:rPr>
+        <w:t xml:space="preserve">Search &amp; filter. </w:t>
+      </w:r>
+      <w:r>
+        <w:t>Search by code/holder/serial, filter by status, or quick-filter to User Assets, Facility or In-warehouse.</w:t>
+      </w:r>
+    </w:p>
+    <w:p>
+      <w:pPr>
+        <w:spacing w:after="80"/>
+        <w:ind w:left="280"/>
+      </w:pPr>
+      <w:r>
+        <w:rPr>
+          <w:b/>
+        </w:rPr>
+        <w:t xml:space="preserve">Add or edit. </w:t>
+      </w:r>
+      <w:r>
+        <w:t>Click Edit on any row to change its code, status, holder and details, or + Add to register a new unit. Holder is an Employee or a Facility only.</w:t>
+      </w:r>
+    </w:p>
+    <w:p>
+      <w:pPr>
+        <w:spacing w:after="80"/>
+        <w:ind w:left="280"/>
+      </w:pPr>
+      <w:r>
+        <w:rPr>
+          <w:b/>
+        </w:rPr>
+        <w:t xml:space="preserve">Pages. </w:t>
+      </w:r>
+      <w:r>
+        <w:t>Choose 10–50 rows per page with Prev/Next. Export the current view to CSV any time.</w:t>
+      </w:r>
+    </w:p>
+    <w:p>
+      <w:pPr>
+        <w:spacing w:after="80"/>
+        <w:ind w:left="280"/>
+      </w:pPr>
+      <w:r>
+        <w:rPr>
+          <w:b/>
+        </w:rPr>
+        <w:t xml:space="preserve">Recover from leavers. </w:t>
+      </w:r>
+      <w:r>
+        <w:t>The Returns — Terminated tab shows each terminated person and the gear they hold; Start recovery then Mark returned brings it back.</w:t>
+      </w:r>
+    </w:p>
+    <w:p>
+      <w:r>
+        <w:rPr>
+          <w:b/>
+          <w:color w:val="2E5496"/>
+          <w:sz w:val="26"/>
+        </w:rPr>
+        <w:t>Journey H — Edit an asset and recover a leaver's equipment</w:t>
+      </w:r>
+    </w:p>
+    <w:p>
+      <w:pPr>
+        <w:spacing w:after="60"/>
+        <w:ind w:left="280"/>
+      </w:pPr>
+      <w:r>
+        <w:t>• Open Assets, pick a class, find the unit (search helps), and click Edit. Change the status or holder and Save.</w:t>
+      </w:r>
+    </w:p>
+    <w:p>
+      <w:pPr>
+        <w:spacing w:after="60"/>
+        <w:ind w:left="280"/>
+      </w:pPr>
+      <w:r>
+        <w:t>• Go to the Returns — Terminated tab. Pick a person and click Start recovery — their assets flip to Return Pending.</w:t>
+      </w:r>
+    </w:p>
+    <w:p>
+      <w:pPr>
+        <w:spacing w:after="60"/>
+        <w:ind w:left="280"/>
+      </w:pPr>
+      <w:r>
+        <w:t>• As each item comes back, click Mark returned to close it out.</w:t>
+      </w:r>
+    </w:p>
+    <w:p>
+      <w:r>
+        <w:rPr>
+          <w:b/>
+          <w:color w:val="2E5496"/>
+          <w:sz w:val="26"/>
+        </w:rPr>
+        <w:t>Equipment Maps — find equipment by facility</w:t>
+      </w:r>
+    </w:p>
+    <w:p>
+      <w:pPr>
+        <w:spacing w:after="80"/>
+        <w:ind w:left="280"/>
+      </w:pPr>
+      <w:r>
+        <w:rPr>
+          <w:b/>
+        </w:rPr>
+        <w:t xml:space="preserve">The map. </w:t>
+      </w:r>
+      <w:r>
+        <w:t>Open Equipment Maps to see every facility with carts on a US map. Pins grow with cart count and turn red when a facility has out-of-service carts.</w:t>
+      </w:r>
+    </w:p>
+    <w:p>
+      <w:pPr>
+        <w:spacing w:after="80"/>
+        <w:ind w:left="280"/>
+      </w:pPr>
+      <w:r>
+        <w:rPr>
+          <w:b/>
+        </w:rPr>
+        <w:t xml:space="preserve">Hover &amp; click. </w:t>
+      </w:r>
+      <w:r>
+        <w:t>Hover a pin for the facility, its equipment and the team in that state. Click it to open a side panel with the full cart list, the employees, and the equipment assigned to each.</w:t>
+      </w:r>
+    </w:p>
+    <w:p>
+      <w:pPr>
+        <w:spacing w:after="80"/>
+        <w:ind w:left="280"/>
+      </w:pPr>
+      <w:r>
+        <w:rPr>
+          <w:b/>
+        </w:rPr>
+        <w:t xml:space="preserve">Find fast. </w:t>
+      </w:r>
+      <w:r>
+        <w:t>Type a facility or a person's name (suggestions appear), or use the State and Regional filters. Tick several facilities in the list to compare them on the map.</w:t>
+      </w:r>
+    </w:p>
+    <w:p>
+      <w:pPr>
+        <w:spacing w:after="80"/>
+        <w:ind w:left="280"/>
+      </w:pPr>
+      <w:r>
+        <w:rPr>
+          <w:b/>
+        </w:rPr>
+        <w:t xml:space="preserve">Good to know. </w:t>
+      </w:r>
+      <w:r>
+        <w:t>Pins sit on real US cities for the demo (live production uses the Google Maps API for exact addresses). Names show as a first name + initial, and each facility shows at least two team members — any marked demo are placeholders, with the real staff shown in production.</w:t>
+      </w:r>
+    </w:p>
+    <w:p>
+      <w:r>
+        <w:rPr>
+          <w:b/>
+          <w:color w:val="2E5496"/>
+          <w:sz w:val="26"/>
+        </w:rPr>
+        <w:t>Journey I — Locate a facility's equipment and team</w:t>
+      </w:r>
+    </w:p>
+    <w:p>
+      <w:pPr>
+        <w:spacing w:after="60"/>
+        <w:ind w:left="280"/>
+      </w:pPr>
+      <w:r>
+        <w:t>• Open Equipment Maps and type the facility name; pick it from the suggestions to fly there.</w:t>
+      </w:r>
+    </w:p>
+    <w:p>
+      <w:pPr>
+        <w:spacing w:after="60"/>
+        <w:ind w:left="280"/>
+      </w:pPr>
+      <w:r>
+        <w:t>• Click the pin. The right-hand panel lists the carts at that site and the people, each with their assigned equipment.</w:t>
+      </w:r>
+    </w:p>
+    <w:p>
+      <w:pPr>
+        <w:spacing w:after="60"/>
+        <w:ind w:left="280"/>
+      </w:pPr>
+      <w:r>
+        <w:t>• Need to compare sites? Tick a few facilities in the list to show just those on the map.</w:t>
+      </w:r>
+    </w:p>
+    <w:p>
+      <w:r>
+        <w:rPr>
+          <w:b/>
+          <w:color w:val="2E5496"/>
+          <w:sz w:val="26"/>
+        </w:rPr>
+        <w:t>The “Change notes” switch</w:t>
+      </w:r>
+    </w:p>
+    <w:p>
+      <w:r>
+        <w:t>A switch in the top bar turns the small green NEW labels and tooltips on or off — leave it on for a guided demo, or turn it off to preview the clean production look.</w:t>
       </w:r>
     </w:p>
     <w:sectPr>

</xml_diff>